<commit_message>
docs: sync the README and solution document with the engine
PROVE is now defined as Published coordinates, Rendered terrain, Other mission,
Verdict, Exceptions, matching the site and replacing the earlier "Predict,
Refine, Only-if Validated Estimation", and the sufficiency gate is described
separately in front of it.

The demo table grows to seven pairs with the Sun-angle and viewpoint results,
half-overlap corrected to 0.53 px and 5/5, and the Sun limitation now carries
the measured figures: about 35 degrees handled, refused at 40.

Page title and meta description were still "Lunar Image Matching and Geospatial
Verification", from the first ideation.
</commit_message>
<xml_diff>
--- a/docs/PS26166_Solution_Document.docx
+++ b/docs/PS26166_Solution_Document.docx
@@ -1916,7 +1916,7 @@
                 <w:b/>
                 <w:bCs/>
               </w:rPr>
-              <w:t xml:space="preserve">Five demo pairs: </w:t>
+              <w:t xml:space="preserve">Seven demo pairs: </w:t>
             </w:r>
             <w:r>
               <w:t>the website loads a real pair, a height-map render, a 5 m zoom gap, a half-overlap pair and a non-overlapping pair that must be refused. See section 6.4.</w:t>
@@ -4209,7 +4209,7 @@
         <w:keepNext/>
       </w:pPr>
       <w:r>
-        <w:t>4.3 PROVE: the five checks</w:t>
+        <w:t>4.3 PROVE, and the sufficiency gate in front of it</w:t>
       </w:r>
     </w:p>
     <w:p>
@@ -4217,7 +4217,7 @@
         <w:spacing w:after="120" w:line="276" w:lineRule="auto"/>
       </w:pPr>
       <w:r>
-        <w:t>PROVE stands for Predict, Refine, Only-if Validated Estimation. Predict where each point should land, refine it by correlation to a fraction of a pixel, keep a more complex model only if it does better on image blocks it never saw, and estimate the final alignment. The PROVE score then reports how many of five checks the result passed. It is not a made-up quality percentage: every check compares one number the engine measured against a fixed limit, and the report shows both.</w:t>
+        <w:t>Our judging layer is split in two, and the split is the idea. A gate first: five checks computed from the engine's own tie points, each comparing one measured number against a fixed limit, reported as STRONG, MODERATE or WEAK. They ask whether there is enough evidence, spread widely enough, to be worth judging. They cannot say the answer is correct, because a matcher that goes wrong the same way everywhere produces points that agree with each other and passes all five. We state that rather than leave it to be found. PROVE comes after the gate and takes only facts that came from outside the two images: P for Published coordinates (where the Moon says a point is, starting with the Vikram lander and extending to LOLA control points), R for Rendered terrain (a height model lit at each image's own Sun angle, which reads the shape of the ground instead of the brightness of the picture, so shadows that moved cannot fool it), O for Other mission (the same ground from a different agency, spacecraft, camera and processing chain), V for the Verdict, and E for the Exceptions it has to state. Anything that reads the two images is excluded by construction, because a check looking at the same pixels can be fooled by the same pixels. That rules out our leftover map, which re-measures the misalignment from the pixels by phase correlation: it is built, it runs on every registration and it is genuinely useful as a second opinion, but it reads the same shadows the matcher did, so we report it beside PROVE and do not call it proof. The three PROVE checks are specified in full and are the next build step.</w:t>
       </w:r>
     </w:p>
     <w:tbl>
@@ -6953,7 +6953,7 @@
                 <w:sz w:val="19"/>
                 <w:szCs w:val="19"/>
               </w:rPr>
-              <w:t>React 19 + TypeScript + Vite + Tailwind. Landing page plus eight layers, all fed by real engine results: workstation, reliability heatmap, coverage hexagons, match lines, geometry and a report with downloads. English and Hindi (Hindi landing text not yet updated).</w:t>
+              <w:t>React 19 + TypeScript + Vite + Tailwind. Landing page plus seven layers, all fed by real engine results: workstation, reliability heatmap, coverage hexagons, match lines, geometry and a report with downloads. English and Hindi (Hindi text for the newer parts not yet updated).</w:t>
             </w:r>
           </w:p>
         </w:tc>
@@ -9415,7 +9415,7 @@
         <w:keepNext/>
       </w:pPr>
       <w:r>
-        <w:t>6.4 The five demo pairs</w:t>
+        <w:t>6.4 The seven demo pairs</w:t>
       </w:r>
     </w:p>
     <w:p>
@@ -9423,7 +9423,7 @@
         <w:spacing w:after="120" w:line="276" w:lineRule="auto"/>
       </w:pPr>
       <w:r>
-        <w:t>The website can load five prepared pairs, so a reviewer can see both a good result and the engine refusing. Only the Vikram pair is entirely real data; the other four are built from that same real data and are labelled as such on the website.</w:t>
+        <w:t>The website can load seven prepared pairs, so a reviewer can see a good result, a borderline one and the engine refusing. All seven are built from the real Vikram landing-site data. Only the Vikram pair is two real camera images; the others are derived from that same real data to isolate one condition each, and the website says so</w:t>
       </w:r>
     </w:p>
     <w:tbl>
@@ -9716,7 +9716,7 @@
                 <w:sz w:val="19"/>
                 <w:szCs w:val="19"/>
               </w:rPr>
-              <w:t>Matching between two very different-looking images</w:t>
+              <w:t>ACCEPTED, 0.49 px, PROVE 5 of 5 STRONG. Two very different-looking images still align.</w:t>
             </w:r>
           </w:p>
         </w:tc>
@@ -9838,6 +9838,184 @@
                 <w:sz w:val="19"/>
                 <w:szCs w:val="19"/>
               </w:rPr>
+              <w:t>Different Sun angle</w:t>
+            </w:r>
+          </w:p>
+        </w:tc>
+        <w:tc>
+          <w:tcPr>
+            <w:tcW w:w="2410" w:type="dxa"/>
+            <w:tcBorders>
+              <w:top w:val="single" w:sz="4" w:space="0" w:color="BFBFBF"/>
+              <w:left w:val="single" w:sz="4" w:space="0" w:color="BFBFBF"/>
+              <w:bottom w:val="single" w:sz="4" w:space="0" w:color="BFBFBF"/>
+              <w:right w:val="single" w:sz="4" w:space="0" w:color="BFBFBF"/>
+            </w:tcBorders>
+            <w:shd w:val="clear" w:color="auto" w:fill="FFFFFF"/>
+            <w:tcMar>
+              <w:top w:w="60" w:type="dxa"/>
+              <w:left w:w="100" w:type="dxa"/>
+              <w:bottom w:w="60" w:type="dxa"/>
+              <w:right w:w="100" w:type="dxa"/>
+            </w:tcMar>
+            <w:vAlign w:val="center"/>
+          </w:tcPr>
+          <w:p>
+            <w:r>
+              <w:rPr>
+                <w:sz w:val="19"/>
+                <w:szCs w:val="19"/>
+              </w:rPr>
+              <w:t>The same height map rendered twice: a low Sun from the north-west against a high Sun from the north, 35 deg apart in direction and 60 deg in elevation. The correct answer is no movement at all, so the error shown is real accuracy.</w:t>
+            </w:r>
+          </w:p>
+        </w:tc>
+        <w:tc>
+          <w:tcPr>
+            <w:tcW w:w="4818" w:type="dxa"/>
+            <w:tcBorders>
+              <w:top w:val="single" w:sz="4" w:space="0" w:color="BFBFBF"/>
+              <w:left w:val="single" w:sz="4" w:space="0" w:color="BFBFBF"/>
+              <w:bottom w:val="single" w:sz="4" w:space="0" w:color="BFBFBF"/>
+              <w:right w:val="single" w:sz="4" w:space="0" w:color="BFBFBF"/>
+            </w:tcBorders>
+            <w:shd w:val="clear" w:color="auto" w:fill="FFFFFF"/>
+            <w:tcMar>
+              <w:top w:w="60" w:type="dxa"/>
+              <w:left w:w="100" w:type="dxa"/>
+              <w:bottom w:w="60" w:type="dxa"/>
+              <w:right w:w="100" w:type="dxa"/>
+            </w:tcMar>
+            <w:vAlign w:val="center"/>
+          </w:tcPr>
+          <w:p>
+            <w:r>
+              <w:rPr>
+                <w:sz w:val="19"/>
+                <w:szCs w:val="19"/>
+              </w:rPr>
+              <w:t>ACCEPTED, 0.19 px, PROVE 5 of 5 STRONG</w:t>
+            </w:r>
+          </w:p>
+        </w:tc>
+      </w:tr>
+      <w:tr>
+        <w:trPr>
+          <w:cantSplit/>
+        </w:trPr>
+        <w:tc>
+          <w:tcPr>
+            <w:tcW w:w="2410" w:type="dxa"/>
+            <w:tcBorders>
+              <w:top w:val="single" w:sz="4" w:space="0" w:color="BFBFBF"/>
+              <w:left w:val="single" w:sz="4" w:space="0" w:color="BFBFBF"/>
+              <w:bottom w:val="single" w:sz="4" w:space="0" w:color="BFBFBF"/>
+              <w:right w:val="single" w:sz="4" w:space="0" w:color="BFBFBF"/>
+            </w:tcBorders>
+            <w:shd w:val="clear" w:color="auto" w:fill="FFFFFF"/>
+            <w:tcMar>
+              <w:top w:w="60" w:type="dxa"/>
+              <w:left w:w="100" w:type="dxa"/>
+              <w:bottom w:w="60" w:type="dxa"/>
+              <w:right w:w="100" w:type="dxa"/>
+            </w:tcMar>
+            <w:vAlign w:val="center"/>
+          </w:tcPr>
+          <w:p>
+            <w:r>
+              <w:rPr>
+                <w:sz w:val="19"/>
+                <w:szCs w:val="19"/>
+              </w:rPr>
+              <w:t>Different viewpoint</w:t>
+            </w:r>
+          </w:p>
+        </w:tc>
+        <w:tc>
+          <w:tcPr>
+            <w:tcW w:w="2410" w:type="dxa"/>
+            <w:tcBorders>
+              <w:top w:val="single" w:sz="4" w:space="0" w:color="BFBFBF"/>
+              <w:left w:val="single" w:sz="4" w:space="0" w:color="BFBFBF"/>
+              <w:bottom w:val="single" w:sz="4" w:space="0" w:color="BFBFBF"/>
+              <w:right w:val="single" w:sz="4" w:space="0" w:color="BFBFBF"/>
+            </w:tcBorders>
+            <w:shd w:val="clear" w:color="auto" w:fill="FFFFFF"/>
+            <w:tcMar>
+              <w:top w:w="60" w:type="dxa"/>
+              <w:left w:w="100" w:type="dxa"/>
+              <w:bottom w:w="60" w:type="dxa"/>
+              <w:right w:w="100" w:type="dxa"/>
+            </w:tcMar>
+            <w:vAlign w:val="center"/>
+          </w:tcPr>
+          <w:p>
+            <w:r>
+              <w:rPr>
+                <w:sz w:val="19"/>
+                <w:szCs w:val="19"/>
+              </w:rPr>
+              <w:t>The same ground seen as if the camera had looked 20 deg off to the side, with a perspective stretch. The warp is known, so the error shown is real accuracy.</w:t>
+            </w:r>
+          </w:p>
+        </w:tc>
+        <w:tc>
+          <w:tcPr>
+            <w:tcW w:w="4818" w:type="dxa"/>
+            <w:tcBorders>
+              <w:top w:val="single" w:sz="4" w:space="0" w:color="BFBFBF"/>
+              <w:left w:val="single" w:sz="4" w:space="0" w:color="BFBFBF"/>
+              <w:bottom w:val="single" w:sz="4" w:space="0" w:color="BFBFBF"/>
+              <w:right w:val="single" w:sz="4" w:space="0" w:color="BFBFBF"/>
+            </w:tcBorders>
+            <w:shd w:val="clear" w:color="auto" w:fill="FFFFFF"/>
+            <w:tcMar>
+              <w:top w:w="60" w:type="dxa"/>
+              <w:left w:w="100" w:type="dxa"/>
+              <w:bottom w:w="60" w:type="dxa"/>
+              <w:right w:w="100" w:type="dxa"/>
+            </w:tcMar>
+            <w:vAlign w:val="center"/>
+          </w:tcPr>
+          <w:p>
+            <w:r>
+              <w:rPr>
+                <w:sz w:val="19"/>
+                <w:szCs w:val="19"/>
+              </w:rPr>
+              <w:t>ACCEPTED, 0.27 px, PROVE 5 of 5 STRONG</w:t>
+            </w:r>
+          </w:p>
+        </w:tc>
+      </w:tr>
+      <w:tr>
+        <w:trPr>
+          <w:cantSplit/>
+        </w:trPr>
+        <w:tc>
+          <w:tcPr>
+            <w:tcW w:w="2410" w:type="dxa"/>
+            <w:tcBorders>
+              <w:top w:val="single" w:sz="4" w:space="0" w:color="BFBFBF"/>
+              <w:left w:val="single" w:sz="4" w:space="0" w:color="BFBFBF"/>
+              <w:bottom w:val="single" w:sz="4" w:space="0" w:color="BFBFBF"/>
+              <w:right w:val="single" w:sz="4" w:space="0" w:color="BFBFBF"/>
+            </w:tcBorders>
+            <w:shd w:val="clear" w:color="auto" w:fill="FFFFFF"/>
+            <w:tcMar>
+              <w:top w:w="60" w:type="dxa"/>
+              <w:left w:w="100" w:type="dxa"/>
+              <w:bottom w:w="60" w:type="dxa"/>
+              <w:right w:w="100" w:type="dxa"/>
+            </w:tcMar>
+            <w:vAlign w:val="center"/>
+          </w:tcPr>
+          <w:p>
+            <w:r>
+              <w:rPr>
+                <w:sz w:val="19"/>
+                <w:szCs w:val="19"/>
+              </w:rPr>
               <w:t>Half overlap</w:t>
             </w:r>
           </w:p>
@@ -9894,7 +10072,7 @@
                 <w:sz w:val="19"/>
                 <w:szCs w:val="19"/>
               </w:rPr>
-              <w:t>Tie points are placed only where the images really overlap</w:t>
+              <w:t>ACCEPTED, 0.53 px, PROVE 5 of 5 STRONG. Tie points are placed only where the images really overlap.</w:t>
             </w:r>
           </w:p>
         </w:tc>
@@ -10079,10 +10257,10 @@
           <w:b/>
           <w:bCs/>
         </w:rPr>
-        <w:t>Big sun-angle changes are not handled yet. This is our biggest gap.</w:t>
+        <w:t>Flipped shadows are not handled yet. This is our biggest gap.</w:t>
       </w:r>
       <w:r>
-        <w:t xml:space="preserve"> The Vikram pair has similar lighting (median correlation 0.90). The fine step copes with images that are brighter or darker, but not with shadows that flip to the other side.</w:t>
+        <w:t xml:space="preserve"> The Vikram pair has similar lighting (median correlation 0.90). The fine step copes with images that are brighter or darker, and with a Sun direction change of up to about 35 degrees, measured on rendered pairs. At a 40 degree change the engine refuses rather than return a wrong answer. Shadows that flip to the other side are still unsolved: shading agreement runs from +0.70 with the Sun on the same side to -0.68 with it on the opposite side.</w:t>
       </w:r>
     </w:p>
     <w:p>
@@ -15824,7 +16002,7 @@
                 <w:sz w:val="19"/>
                 <w:szCs w:val="19"/>
               </w:rPr>
-              <w:t>Landing page, eight analysis layers, English / Hindi</w:t>
+              <w:t>Landing page, seven analysis layers, English / Hindi</w:t>
             </w:r>
           </w:p>
         </w:tc>
@@ -15999,7 +16177,7 @@
                 <w:sz w:val="19"/>
                 <w:szCs w:val="19"/>
               </w:rPr>
-              <w:t>Uploads, the real sample pair and all eight layers use engine results</w:t>
+              <w:t>Uploads, the real sample pairs and all seven layers use engine results</w:t>
             </w:r>
           </w:p>
         </w:tc>

</xml_diff>